<commit_message>
add server side description in diploma text, add letters to words conversion
</commit_message>
<xml_diff>
--- a/Федорняк_диплом.docx
+++ b/Федорняк_диплом.docx
@@ -7180,7 +7180,27 @@
           <w:szCs w:val="28"/>
           <w:lang w:val="en-US"/>
         </w:rPr>
-        <w:t>M2 parity</w:t>
+        <w:t>M2</w:t>
+      </w:r>
+      <w:r>
+        <w:rPr>
+          <w:b/>
+          <w:bCs/>
+          <w:sz w:val="28"/>
+          <w:szCs w:val="28"/>
+          <w:lang w:val="en-US"/>
+        </w:rPr>
+        <w:t>-</w:t>
+      </w:r>
+      <w:r>
+        <w:rPr>
+          <w:b/>
+          <w:bCs/>
+          <w:sz w:val="28"/>
+          <w:szCs w:val="28"/>
+          <w:lang w:val="en-US"/>
+        </w:rPr>
+        <w:t>parity</w:t>
       </w:r>
     </w:p>
     <w:p>
@@ -9222,39 +9242,7 @@
           <w:szCs w:val="28"/>
           <w:lang w:val="en-US"/>
         </w:rPr>
-        <w:t>“</w:t>
-      </w:r>
-      <w:r>
-        <w:rPr>
-          <w:sz w:val="28"/>
-          <w:szCs w:val="28"/>
-          <w:lang w:val="en-US"/>
-        </w:rPr>
-        <w:t>fill_</w:t>
-      </w:r>
-      <w:r>
-        <w:rPr>
-          <w:sz w:val="28"/>
-          <w:szCs w:val="28"/>
-          <w:lang w:val="en-US"/>
-        </w:rPr>
-        <w:t>corners</w:t>
-      </w:r>
-      <w:r>
-        <w:rPr>
-          <w:sz w:val="28"/>
-          <w:szCs w:val="28"/>
-          <w:lang w:val="en-US"/>
-        </w:rPr>
-        <w:t>_from_string()</w:t>
-      </w:r>
-      <w:r>
-        <w:rPr>
-          <w:sz w:val="28"/>
-          <w:szCs w:val="28"/>
-          <w:lang w:val="en-US"/>
-        </w:rPr>
-        <w:t>”</w:t>
+        <w:t>“fill_corners_from_string()”</w:t>
       </w:r>
       <w:r>
         <w:rPr>
@@ -9287,39 +9275,7 @@
           <w:szCs w:val="28"/>
           <w:lang w:val="en-US"/>
         </w:rPr>
-        <w:t>“</w:t>
-      </w:r>
-      <w:r>
-        <w:rPr>
-          <w:sz w:val="28"/>
-          <w:szCs w:val="28"/>
-          <w:lang w:val="en-US"/>
-        </w:rPr>
-        <w:t>fill_</w:t>
-      </w:r>
-      <w:r>
-        <w:rPr>
-          <w:sz w:val="28"/>
-          <w:szCs w:val="28"/>
-          <w:lang w:val="en-US"/>
-        </w:rPr>
-        <w:t>corners</w:t>
-      </w:r>
-      <w:r>
-        <w:rPr>
-          <w:sz w:val="28"/>
-          <w:szCs w:val="28"/>
-          <w:lang w:val="en-US"/>
-        </w:rPr>
-        <w:t>_from_string()”</w:t>
-      </w:r>
-      <w:r>
-        <w:rPr>
-          <w:sz w:val="28"/>
-          <w:szCs w:val="28"/>
-          <w:lang w:val="en-US"/>
-        </w:rPr>
-        <w:t xml:space="preserve"> (</w:t>
+        <w:t>“fill_corners_from_string()” (</w:t>
       </w:r>
       <w:r>
         <w:rPr>
@@ -9505,14 +9461,7 @@
           <w:sz w:val="28"/>
           <w:szCs w:val="28"/>
         </w:rPr>
-        <w:t xml:space="preserve"> </w:t>
-      </w:r>
-      <w:r>
-        <w:rPr>
-          <w:sz w:val="28"/>
-          <w:szCs w:val="28"/>
-        </w:rPr>
-        <w:t>Функція для перетворення текстового представлення кутів у внутрішню структуру кубика</w:t>
+        <w:t xml:space="preserve"> Функція для перетворення текстового представлення кутів у внутрішню структуру кубика</w:t>
       </w:r>
     </w:p>
     <w:p>
@@ -9689,28 +9638,7 @@
           <w:sz w:val="28"/>
           <w:szCs w:val="28"/>
         </w:rPr>
-        <w:t xml:space="preserve"> Функція для перетворення </w:t>
-      </w:r>
-      <w:r>
-        <w:rPr>
-          <w:sz w:val="28"/>
-          <w:szCs w:val="28"/>
-        </w:rPr>
-        <w:t xml:space="preserve">текстового представлення </w:t>
-      </w:r>
-      <w:r>
-        <w:rPr>
-          <w:sz w:val="28"/>
-          <w:szCs w:val="28"/>
-        </w:rPr>
-        <w:t>ребер</w:t>
-      </w:r>
-      <w:r>
-        <w:rPr>
-          <w:sz w:val="28"/>
-          <w:szCs w:val="28"/>
-        </w:rPr>
-        <w:t xml:space="preserve"> у внутрішню структуру кубика</w:t>
+        <w:t xml:space="preserve"> Функція для перетворення текстового представлення ребер у внутрішню структуру кубика</w:t>
       </w:r>
     </w:p>
     <w:p>
@@ -10037,21 +9965,7 @@
           <w:sz w:val="28"/>
           <w:szCs w:val="28"/>
         </w:rPr>
-        <w:t xml:space="preserve">складаються елементи, які на свої місцях, але </w:t>
-      </w:r>
-      <w:r>
-        <w:rPr>
-          <w:sz w:val="28"/>
-          <w:szCs w:val="28"/>
-        </w:rPr>
-        <w:t>в неправильній орієнтації</w:t>
-      </w:r>
-      <w:r>
-        <w:rPr>
-          <w:sz w:val="28"/>
-          <w:szCs w:val="28"/>
-        </w:rPr>
-        <w:t>,</w:t>
+        <w:t>складаються елементи, які на свої місцях, але в неправильній орієнтації,</w:t>
       </w:r>
       <w:r>
         <w:rPr>
@@ -10066,14 +9980,7 @@
           <w:sz w:val="28"/>
           <w:szCs w:val="28"/>
         </w:rPr>
-        <w:t>якщо такі існують,</w:t>
-      </w:r>
-      <w:r>
-        <w:rPr>
-          <w:sz w:val="28"/>
-          <w:szCs w:val="28"/>
-        </w:rPr>
-        <w:t xml:space="preserve"> див. рисунок 2.3.</w:t>
+        <w:t>якщо такі існують, див. рисунок 2.3.</w:t>
       </w:r>
     </w:p>
     <w:p>
@@ -10268,14 +10175,7 @@
           <w:sz w:val="28"/>
           <w:szCs w:val="28"/>
         </w:rPr>
-        <w:t xml:space="preserve">Для знаходження послідовності переміщення ребер </w:t>
-      </w:r>
-      <w:r>
-        <w:rPr>
-          <w:sz w:val="28"/>
-          <w:szCs w:val="28"/>
-        </w:rPr>
-        <w:t xml:space="preserve">методом </w:t>
+        <w:t xml:space="preserve">Для знаходження послідовності переміщення ребер методом </w:t>
       </w:r>
       <w:r>
         <w:rPr>
@@ -10335,21 +10235,7 @@
           <w:sz w:val="28"/>
           <w:szCs w:val="28"/>
         </w:rPr>
-        <w:t xml:space="preserve">Вона працює за </w:t>
-      </w:r>
-      <w:r>
-        <w:rPr>
-          <w:sz w:val="28"/>
-          <w:szCs w:val="28"/>
-        </w:rPr>
-        <w:t>схожим</w:t>
-      </w:r>
-      <w:r>
-        <w:rPr>
-          <w:sz w:val="28"/>
-          <w:szCs w:val="28"/>
-        </w:rPr>
-        <w:t xml:space="preserve"> принципом як і </w:t>
+        <w:t xml:space="preserve">Вона працює за схожим принципом як і </w:t>
       </w:r>
       <w:r>
         <w:rPr>
@@ -10389,56 +10275,7 @@
           <w:sz w:val="28"/>
           <w:szCs w:val="28"/>
         </w:rPr>
-        <w:t xml:space="preserve">, див. 2.2.2 . Основна відмінність </w:t>
-      </w:r>
-      <w:r>
-        <w:rPr>
-          <w:sz w:val="28"/>
-          <w:szCs w:val="28"/>
-        </w:rPr>
-        <w:t xml:space="preserve">полягає </w:t>
-      </w:r>
-      <w:r>
-        <w:rPr>
-          <w:sz w:val="28"/>
-          <w:szCs w:val="28"/>
-        </w:rPr>
-        <w:t xml:space="preserve">в тому, що кут складається з трьох </w:t>
-      </w:r>
-      <w:r>
-        <w:rPr>
-          <w:sz w:val="28"/>
-          <w:szCs w:val="28"/>
-        </w:rPr>
-        <w:t>кольорових наліпок,</w:t>
-      </w:r>
-      <w:r>
-        <w:rPr>
-          <w:sz w:val="28"/>
-          <w:szCs w:val="28"/>
-        </w:rPr>
-        <w:t xml:space="preserve"> а ребро </w:t>
-      </w:r>
-      <w:r>
-        <w:rPr>
-          <w:sz w:val="28"/>
-          <w:szCs w:val="28"/>
-        </w:rPr>
-        <w:t xml:space="preserve">лише </w:t>
-      </w:r>
-      <w:r>
-        <w:rPr>
-          <w:sz w:val="28"/>
-          <w:szCs w:val="28"/>
-        </w:rPr>
-        <w:t xml:space="preserve">з двох. </w:t>
-      </w:r>
-      <w:r>
-        <w:rPr>
-          <w:sz w:val="28"/>
-          <w:szCs w:val="28"/>
-        </w:rPr>
-        <w:t xml:space="preserve">У процесі роботи функція послідовно визначає перестановки ребер відносно буферної позиції та формує відповідний ланцюжок переміщень. Додатково наприкінці виконується обробка ребер з неправильною орієнтацією за допомогою функції </w:t>
+        <w:t xml:space="preserve">, див. 2.2.2 . Основна відмінність полягає в тому, що кут складається з трьох кольорових наліпок, а ребро лише з двох. У процесі роботи функція послідовно визначає перестановки ребер відносно буферної позиції та формує відповідний ланцюжок переміщень. Додатково наприкінці виконується обробка ребер з неправильною орієнтацією за допомогою функції </w:t>
       </w:r>
       <w:r>
         <w:rPr>
@@ -10585,14 +10422,7 @@
           <w:sz w:val="28"/>
           <w:szCs w:val="28"/>
         </w:rPr>
-        <w:t xml:space="preserve"> О</w:t>
-      </w:r>
-      <w:r>
-        <w:rPr>
-          <w:sz w:val="28"/>
-          <w:szCs w:val="28"/>
-        </w:rPr>
-        <w:t xml:space="preserve">скільки кожна техніка складання кубика Рубіка наосліп полягає в </w:t>
+        <w:t xml:space="preserve"> Оскільки кожна техніка складання кубика Рубіка наосліп полягає в </w:t>
       </w:r>
       <w:proofErr w:type="spellStart"/>
       <w:r>
@@ -11017,21 +10847,7 @@
           <w:sz w:val="28"/>
           <w:szCs w:val="28"/>
         </w:rPr>
-        <w:t xml:space="preserve">Щоб отримати буквенну послідовність </w:t>
-      </w:r>
-      <w:r>
-        <w:rPr>
-          <w:sz w:val="28"/>
-          <w:szCs w:val="28"/>
-        </w:rPr>
-        <w:t xml:space="preserve">кутів </w:t>
-      </w:r>
-      <w:r>
-        <w:rPr>
-          <w:sz w:val="28"/>
-          <w:szCs w:val="28"/>
-        </w:rPr>
-        <w:t>використовується</w:t>
+        <w:t>Щоб отримати буквенну послідовність кутів використовується</w:t>
       </w:r>
     </w:p>
     <w:p>
@@ -11212,25 +11028,974 @@
           <w:sz w:val="28"/>
           <w:szCs w:val="28"/>
         </w:rPr>
+        <w:t xml:space="preserve"> Функція для отримання буквенної послідовності кутів</w:t>
+      </w:r>
+    </w:p>
+    <w:p>
+      <w:pPr>
+        <w:spacing w:line="360" w:lineRule="auto"/>
+        <w:rPr>
+          <w:sz w:val="28"/>
+          <w:szCs w:val="28"/>
+          <w:lang w:val="en-US"/>
+        </w:rPr>
+      </w:pPr>
+      <w:r>
+        <w:rPr>
+          <w:sz w:val="28"/>
+          <w:szCs w:val="28"/>
+        </w:rPr>
+        <w:tab/>
+        <w:t xml:space="preserve">Після формування буквенної послідовності, виконується генерація мнемонічних підказок, які використовуються для спрощення запам’ятовування перестановок під час збірки наосліп. Для цього використовується функція </w:t>
+      </w:r>
+      <w:r>
+        <w:rPr>
+          <w:sz w:val="28"/>
+          <w:szCs w:val="28"/>
+          <w:lang w:val="en-US"/>
+        </w:rPr>
+        <w:t>“</w:t>
+      </w:r>
+      <w:proofErr w:type="spellStart"/>
+      <w:r>
+        <w:rPr>
+          <w:sz w:val="28"/>
+          <w:szCs w:val="28"/>
+          <w:lang w:val="en-US"/>
+        </w:rPr>
+        <w:t>letters_to_words</w:t>
+      </w:r>
+      <w:proofErr w:type="spellEnd"/>
+      <w:r>
+        <w:rPr>
+          <w:sz w:val="28"/>
+          <w:szCs w:val="28"/>
+          <w:lang w:val="en-US"/>
+        </w:rPr>
+        <w:t>()”.</w:t>
+      </w:r>
+    </w:p>
+    <w:p>
+      <w:pPr>
+        <w:spacing w:line="360" w:lineRule="auto"/>
+        <w:rPr>
+          <w:sz w:val="28"/>
+          <w:szCs w:val="28"/>
+        </w:rPr>
+      </w:pPr>
+      <w:r>
+        <w:rPr>
+          <w:sz w:val="28"/>
+          <w:szCs w:val="28"/>
+          <w:lang w:val="en-US"/>
+        </w:rPr>
+        <w:tab/>
+      </w:r>
+      <w:r>
+        <w:rPr>
+          <w:sz w:val="28"/>
+          <w:szCs w:val="28"/>
+        </w:rPr>
+        <w:t xml:space="preserve">Функція працює на основі таблиці </w:t>
+      </w:r>
+      <w:proofErr w:type="spellStart"/>
+      <w:r>
+        <w:rPr>
+          <w:sz w:val="28"/>
+          <w:szCs w:val="28"/>
+        </w:rPr>
+        <w:t>відповідностей</w:t>
+      </w:r>
+      <w:proofErr w:type="spellEnd"/>
+      <w:r>
+        <w:rPr>
+          <w:sz w:val="28"/>
+          <w:szCs w:val="28"/>
+        </w:rPr>
+        <w:t xml:space="preserve">. Для кожної пари букв визначено слово, яке використовується як мнемонічна асоціація. </w:t>
+      </w:r>
+    </w:p>
+    <w:p>
+      <w:pPr>
+        <w:spacing w:line="360" w:lineRule="auto"/>
+        <w:rPr>
+          <w:sz w:val="28"/>
+          <w:szCs w:val="28"/>
+        </w:rPr>
+      </w:pPr>
+      <w:r>
+        <w:rPr>
+          <w:sz w:val="28"/>
+          <w:szCs w:val="28"/>
+        </w:rPr>
+        <w:tab/>
+        <w:t xml:space="preserve">Далі буквенна послідовність обробляється попарно. Для кожної пари літер виконується пошук відповідного слова у таблиці мнемонічних асоціацій. У </w:t>
+      </w:r>
+      <w:r>
+        <w:rPr>
+          <w:sz w:val="28"/>
+          <w:szCs w:val="28"/>
+        </w:rPr>
+        <w:lastRenderedPageBreak/>
+        <w:t xml:space="preserve">випадку непарної кількості перестановок, до списку слів додається остання літера без </w:t>
+      </w:r>
+      <w:r>
+        <w:rPr>
+          <w:sz w:val="28"/>
+          <w:szCs w:val="28"/>
+        </w:rPr>
+        <w:t>знаходження відповідника.</w:t>
+      </w:r>
+    </w:p>
+    <w:p>
+      <w:pPr>
+        <w:spacing w:line="360" w:lineRule="auto"/>
+        <w:rPr>
+          <w:sz w:val="28"/>
+          <w:szCs w:val="28"/>
+        </w:rPr>
+      </w:pPr>
+      <w:r>
+        <w:rPr>
+          <w:sz w:val="28"/>
+          <w:szCs w:val="28"/>
+        </w:rPr>
+        <w:tab/>
+        <w:t>Отримані мнемонічні підказки використовуються користувачем під час етапу аналізу та запам’ятовування перестановок перед складанням кубика Рубіка наосліп.</w:t>
+      </w:r>
+    </w:p>
+    <w:p>
+      <w:pPr>
+        <w:spacing w:line="360" w:lineRule="auto"/>
+        <w:rPr>
+          <w:sz w:val="28"/>
+          <w:szCs w:val="28"/>
+        </w:rPr>
+      </w:pPr>
+      <w:r>
+        <w:rPr>
+          <w:sz w:val="28"/>
+          <w:szCs w:val="28"/>
+        </w:rPr>
+        <w:tab/>
+      </w:r>
+    </w:p>
+    <w:p>
+      <w:pPr>
+        <w:spacing w:line="360" w:lineRule="auto"/>
+        <w:rPr>
+          <w:b/>
+          <w:bCs/>
+          <w:sz w:val="28"/>
+          <w:szCs w:val="28"/>
+        </w:rPr>
+      </w:pPr>
+      <w:r>
+        <w:rPr>
+          <w:sz w:val="28"/>
+          <w:szCs w:val="28"/>
+        </w:rPr>
+        <w:tab/>
+      </w:r>
+      <w:r>
+        <w:rPr>
+          <w:b/>
+          <w:bCs/>
+          <w:sz w:val="28"/>
+          <w:szCs w:val="28"/>
+        </w:rPr>
+        <w:t>2.2.6 Перетворення буквенної послідовності у запис ходів кубика Рубіка</w:t>
+      </w:r>
+    </w:p>
+    <w:p>
+      <w:pPr>
+        <w:spacing w:line="360" w:lineRule="auto"/>
+        <w:rPr>
+          <w:sz w:val="28"/>
+          <w:szCs w:val="28"/>
+        </w:rPr>
+      </w:pPr>
+      <w:r>
+        <w:rPr>
+          <w:sz w:val="28"/>
+          <w:szCs w:val="28"/>
+        </w:rPr>
+        <w:tab/>
+      </w:r>
+    </w:p>
+    <w:p>
+      <w:pPr>
+        <w:spacing w:line="360" w:lineRule="auto"/>
+        <w:rPr>
+          <w:sz w:val="28"/>
+          <w:szCs w:val="28"/>
+        </w:rPr>
+      </w:pPr>
+      <w:r>
+        <w:rPr>
+          <w:sz w:val="28"/>
+          <w:szCs w:val="28"/>
+        </w:rPr>
+        <w:tab/>
+        <w:t>Після формування буквенної послідовності, що відображає порядок перестановок кутів та ребер, наступним етапом є її перетворення у нотацію ходів кубика Рубіка. Складання одного елемента називається циклом. Він складається з підготовчих ходів, алгоритму перестановки</w:t>
+      </w:r>
+      <w:r>
+        <w:rPr>
+          <w:sz w:val="28"/>
+          <w:szCs w:val="28"/>
+          <w:lang w:val="en-US"/>
+        </w:rPr>
+        <w:t xml:space="preserve">: </w:t>
+      </w:r>
+      <w:r>
+        <w:rPr>
+          <w:sz w:val="28"/>
+          <w:szCs w:val="28"/>
+        </w:rPr>
+        <w:t xml:space="preserve">для методу М2 це подвійний рух середнього шару, а для </w:t>
+      </w:r>
+      <w:r>
+        <w:rPr>
+          <w:sz w:val="28"/>
+          <w:szCs w:val="28"/>
+          <w:lang w:val="en-US"/>
+        </w:rPr>
+        <w:t xml:space="preserve">Old </w:t>
+      </w:r>
+      <w:proofErr w:type="spellStart"/>
+      <w:r>
+        <w:rPr>
+          <w:sz w:val="28"/>
+          <w:szCs w:val="28"/>
+          <w:lang w:val="en-US"/>
+        </w:rPr>
+        <w:t>Pochmann</w:t>
+      </w:r>
+      <w:proofErr w:type="spellEnd"/>
+      <w:r>
+        <w:rPr>
+          <w:sz w:val="28"/>
+          <w:szCs w:val="28"/>
+        </w:rPr>
+        <w:t xml:space="preserve"> рухи, описані в пунктах 1.3.3 та 1.3.4.</w:t>
+      </w:r>
+    </w:p>
+    <w:p>
+      <w:pPr>
+        <w:spacing w:line="360" w:lineRule="auto"/>
+        <w:rPr>
+          <w:sz w:val="28"/>
+          <w:szCs w:val="28"/>
+        </w:rPr>
+      </w:pPr>
+      <w:r>
+        <w:rPr>
+          <w:sz w:val="28"/>
+          <w:szCs w:val="28"/>
+        </w:rPr>
+        <w:tab/>
+        <w:t xml:space="preserve">На даному етапі виконується побудова послідовності циклів для кожного типу елементів. Для кутів використовується функція </w:t>
+      </w:r>
+      <w:r>
+        <w:rPr>
+          <w:sz w:val="28"/>
+          <w:szCs w:val="28"/>
+          <w:lang w:val="en-US"/>
+        </w:rPr>
+        <w:t>“</w:t>
+      </w:r>
+      <w:proofErr w:type="spellStart"/>
+      <w:r>
+        <w:rPr>
+          <w:sz w:val="28"/>
+          <w:szCs w:val="28"/>
+        </w:rPr>
+        <w:t>Get_corner_algorithm</w:t>
+      </w:r>
+      <w:proofErr w:type="spellEnd"/>
+      <w:r>
+        <w:rPr>
+          <w:sz w:val="28"/>
+          <w:szCs w:val="28"/>
+        </w:rPr>
+        <w:t>()</w:t>
+      </w:r>
+      <w:r>
+        <w:rPr>
+          <w:sz w:val="28"/>
+          <w:szCs w:val="28"/>
+          <w:lang w:val="en-US"/>
+        </w:rPr>
+        <w:t>”</w:t>
+      </w:r>
+      <w:r>
+        <w:rPr>
+          <w:sz w:val="28"/>
+          <w:szCs w:val="28"/>
+        </w:rPr>
+        <w:t xml:space="preserve">, а для ребер </w:t>
+      </w:r>
+      <w:r>
+        <w:rPr>
+          <w:sz w:val="28"/>
+          <w:szCs w:val="28"/>
+        </w:rPr>
+        <w:t>–</w:t>
+      </w:r>
+      <w:r>
+        <w:rPr>
+          <w:sz w:val="28"/>
+          <w:szCs w:val="28"/>
+        </w:rPr>
         <w:t xml:space="preserve"> </w:t>
       </w:r>
       <w:r>
         <w:rPr>
           <w:sz w:val="28"/>
           <w:szCs w:val="28"/>
-        </w:rPr>
-        <w:t xml:space="preserve">Функція для отримання буквенної послідовності </w:t>
-      </w:r>
-      <w:r>
-        <w:rPr>
-          <w:sz w:val="28"/>
-          <w:szCs w:val="28"/>
-        </w:rPr>
-        <w:t>кутів</w:t>
+          <w:lang w:val="en-US"/>
+        </w:rPr>
+        <w:t>“</w:t>
+      </w:r>
+      <w:proofErr w:type="spellStart"/>
+      <w:r>
+        <w:rPr>
+          <w:sz w:val="28"/>
+          <w:szCs w:val="28"/>
+          <w:lang w:val="en-US"/>
+        </w:rPr>
+        <w:t>Get_edges_algorithm</w:t>
+      </w:r>
+      <w:proofErr w:type="spellEnd"/>
+      <w:r>
+        <w:rPr>
+          <w:sz w:val="28"/>
+          <w:szCs w:val="28"/>
+          <w:lang w:val="en-US"/>
+        </w:rPr>
+        <w:t xml:space="preserve">()” </w:t>
+      </w:r>
+      <w:r>
+        <w:rPr>
+          <w:sz w:val="28"/>
+          <w:szCs w:val="28"/>
+        </w:rPr>
+        <w:t xml:space="preserve">або </w:t>
+      </w:r>
+      <w:r>
+        <w:rPr>
+          <w:sz w:val="28"/>
+          <w:szCs w:val="28"/>
+          <w:lang w:val="en-US"/>
+        </w:rPr>
+        <w:t>“Get_edges_algorithm_m2”</w:t>
+      </w:r>
+      <w:r>
+        <w:rPr>
+          <w:sz w:val="28"/>
+          <w:szCs w:val="28"/>
+        </w:rPr>
+        <w:t xml:space="preserve"> в залежності від вибраного методу.</w:t>
+      </w:r>
+    </w:p>
+    <w:p>
+      <w:pPr>
+        <w:spacing w:line="360" w:lineRule="auto"/>
+        <w:rPr>
+          <w:sz w:val="28"/>
+          <w:szCs w:val="28"/>
+        </w:rPr>
+      </w:pPr>
+      <w:r>
+        <w:rPr>
+          <w:sz w:val="28"/>
+          <w:szCs w:val="28"/>
+        </w:rPr>
+        <w:tab/>
+        <w:t xml:space="preserve">Окремо передбачено спеціальний випадок обробки ребер, який реалізовано у функції </w:t>
+      </w:r>
+      <w:r>
+        <w:rPr>
+          <w:sz w:val="28"/>
+          <w:szCs w:val="28"/>
+          <w:lang w:val="en-US"/>
+        </w:rPr>
+        <w:t>“Get_edges_algorithm_m2” (</w:t>
+      </w:r>
+      <w:r>
+        <w:rPr>
+          <w:sz w:val="28"/>
+          <w:szCs w:val="28"/>
+        </w:rPr>
+        <w:t>див. рисунок 2.6</w:t>
+      </w:r>
+      <w:r>
+        <w:rPr>
+          <w:sz w:val="28"/>
+          <w:szCs w:val="28"/>
+          <w:lang w:val="en-US"/>
+        </w:rPr>
+        <w:t>)</w:t>
+      </w:r>
+      <w:r>
+        <w:rPr>
+          <w:sz w:val="28"/>
+          <w:szCs w:val="28"/>
+        </w:rPr>
+        <w:t xml:space="preserve">. Вона </w:t>
+      </w:r>
+      <w:r>
+        <w:rPr>
+          <w:sz w:val="28"/>
+          <w:szCs w:val="28"/>
+        </w:rPr>
+        <w:t>відрізняється тим, що у випадку, коли елемент середнього шару потрапляє на другу позицію в парі букв, використовуються алгоритми для протилежного ребра.</w:t>
+      </w:r>
+    </w:p>
+    <w:p>
+      <w:pPr>
+        <w:spacing w:line="360" w:lineRule="auto"/>
+        <w:jc w:val="center"/>
+        <w:rPr>
+          <w:sz w:val="28"/>
+          <w:szCs w:val="28"/>
+        </w:rPr>
+      </w:pPr>
+      <w:r>
+        <w:rPr>
+          <w:noProof/>
+          <w14:ligatures w14:val="standardContextual"/>
+        </w:rPr>
+        <w:lastRenderedPageBreak/>
+        <w:drawing>
+          <wp:inline distT="0" distB="0" distL="0" distR="0" wp14:anchorId="740288D7" wp14:editId="30532706">
+            <wp:extent cx="2608628" cy="3703320"/>
+            <wp:effectExtent l="0" t="0" r="1270" b="0"/>
+            <wp:docPr id="479246586" name="Рисунок 1"/>
+            <wp:cNvGraphicFramePr>
+              <a:graphicFrameLocks xmlns:a="http://schemas.openxmlformats.org/drawingml/2006/main" noChangeAspect="1"/>
+            </wp:cNvGraphicFramePr>
+            <a:graphic xmlns:a="http://schemas.openxmlformats.org/drawingml/2006/main">
+              <a:graphicData uri="http://schemas.openxmlformats.org/drawingml/2006/picture">
+                <pic:pic xmlns:pic="http://schemas.openxmlformats.org/drawingml/2006/picture">
+                  <pic:nvPicPr>
+                    <pic:cNvPr id="479246586" name=""/>
+                    <pic:cNvPicPr/>
+                  </pic:nvPicPr>
+                  <pic:blipFill>
+                    <a:blip r:embed="rId20"/>
+                    <a:stretch>
+                      <a:fillRect/>
+                    </a:stretch>
+                  </pic:blipFill>
+                  <pic:spPr>
+                    <a:xfrm>
+                      <a:off x="0" y="0"/>
+                      <a:ext cx="2614400" cy="3711514"/>
+                    </a:xfrm>
+                    <a:prstGeom prst="rect">
+                      <a:avLst/>
+                    </a:prstGeom>
+                  </pic:spPr>
+                </pic:pic>
+              </a:graphicData>
+            </a:graphic>
+          </wp:inline>
+        </w:drawing>
+      </w:r>
+    </w:p>
+    <w:p>
+      <w:pPr>
+        <w:spacing w:line="360" w:lineRule="auto"/>
+        <w:jc w:val="center"/>
+        <w:rPr>
+          <w:sz w:val="28"/>
+          <w:szCs w:val="28"/>
+        </w:rPr>
+      </w:pPr>
+      <w:r>
+        <w:rPr>
+          <w:sz w:val="28"/>
+          <w:szCs w:val="28"/>
+        </w:rPr>
+        <w:t xml:space="preserve">Рисунок 2.6 </w:t>
+      </w:r>
+      <w:r>
+        <w:rPr>
+          <w:sz w:val="28"/>
+          <w:szCs w:val="28"/>
+        </w:rPr>
+        <w:t>–</w:t>
+      </w:r>
+      <w:r>
+        <w:rPr>
+          <w:sz w:val="28"/>
+          <w:szCs w:val="28"/>
+        </w:rPr>
+        <w:t xml:space="preserve"> Функція для отримання послідовності рухів для складання ребер у нотації кубика Рубіка</w:t>
+      </w:r>
+    </w:p>
+    <w:p>
+      <w:pPr>
+        <w:spacing w:line="360" w:lineRule="auto"/>
+        <w:jc w:val="center"/>
+        <w:rPr>
+          <w:sz w:val="28"/>
+          <w:szCs w:val="28"/>
+        </w:rPr>
+      </w:pPr>
+    </w:p>
+    <w:p>
+      <w:pPr>
+        <w:spacing w:line="360" w:lineRule="auto"/>
+        <w:jc w:val="both"/>
+        <w:rPr>
+          <w:b/>
+          <w:bCs/>
+          <w:sz w:val="28"/>
+          <w:szCs w:val="28"/>
+        </w:rPr>
+      </w:pPr>
+      <w:r>
+        <w:rPr>
+          <w:sz w:val="28"/>
+          <w:szCs w:val="28"/>
+        </w:rPr>
+        <w:tab/>
+      </w:r>
+      <w:r>
+        <w:rPr>
+          <w:b/>
+          <w:bCs/>
+          <w:sz w:val="28"/>
+          <w:szCs w:val="28"/>
+        </w:rPr>
+        <w:t>2.2.7 Обробка запитів користувача</w:t>
+      </w:r>
+    </w:p>
+    <w:p>
+      <w:pPr>
+        <w:spacing w:line="360" w:lineRule="auto"/>
+        <w:jc w:val="both"/>
+        <w:rPr>
+          <w:b/>
+          <w:bCs/>
+          <w:sz w:val="28"/>
+          <w:szCs w:val="28"/>
+        </w:rPr>
+      </w:pPr>
+    </w:p>
+    <w:p>
+      <w:pPr>
+        <w:spacing w:line="360" w:lineRule="auto"/>
+        <w:jc w:val="both"/>
+        <w:rPr>
+          <w:sz w:val="28"/>
+          <w:szCs w:val="28"/>
+        </w:rPr>
+      </w:pPr>
+      <w:r>
+        <w:rPr>
+          <w:sz w:val="28"/>
+          <w:szCs w:val="28"/>
+        </w:rPr>
+        <w:tab/>
+        <w:t xml:space="preserve">Для обробки запитів користувача реалізоване відповідне </w:t>
+      </w:r>
+      <w:r>
+        <w:rPr>
+          <w:sz w:val="28"/>
+          <w:szCs w:val="28"/>
+          <w:lang w:val="en-US"/>
+        </w:rPr>
+        <w:t>view</w:t>
+      </w:r>
+      <w:r>
+        <w:rPr>
+          <w:sz w:val="28"/>
+          <w:szCs w:val="28"/>
+          <w:lang w:val="en-US"/>
+        </w:rPr>
+        <w:t>: “</w:t>
+      </w:r>
+      <w:proofErr w:type="spellStart"/>
+      <w:r>
+        <w:rPr>
+          <w:sz w:val="28"/>
+          <w:szCs w:val="28"/>
+          <w:lang w:val="en-US"/>
+        </w:rPr>
+        <w:t>solve_rubiks_cube_view</w:t>
+      </w:r>
+      <w:proofErr w:type="spellEnd"/>
+      <w:r>
+        <w:rPr>
+          <w:sz w:val="28"/>
+          <w:szCs w:val="28"/>
+          <w:lang w:val="en-US"/>
+        </w:rPr>
+        <w:t>()”</w:t>
+      </w:r>
+      <w:r>
+        <w:rPr>
+          <w:sz w:val="28"/>
+          <w:szCs w:val="28"/>
+        </w:rPr>
+        <w:t>, див рисунок 2.7.</w:t>
+      </w:r>
+      <w:r>
+        <w:rPr>
+          <w:sz w:val="28"/>
+          <w:szCs w:val="28"/>
+          <w:lang w:val="en-US"/>
+        </w:rPr>
+        <w:t xml:space="preserve"> </w:t>
+      </w:r>
+      <w:r>
+        <w:rPr>
+          <w:sz w:val="28"/>
+          <w:szCs w:val="28"/>
+        </w:rPr>
+        <w:t xml:space="preserve">Дане представлення є основною точкою входу для взаємодії клієнтської та серверної частини застосунку. Воно приймає запити у форматі </w:t>
+      </w:r>
+      <w:r>
+        <w:rPr>
+          <w:sz w:val="28"/>
+          <w:szCs w:val="28"/>
+          <w:lang w:val="en-US"/>
+        </w:rPr>
+        <w:t xml:space="preserve">JSON, </w:t>
+      </w:r>
+      <w:r>
+        <w:rPr>
+          <w:sz w:val="28"/>
+          <w:szCs w:val="28"/>
+        </w:rPr>
+        <w:t>що містять вхідні дані розгортки кубика Рубіка, а також метод складання ребер.</w:t>
+      </w:r>
+    </w:p>
+    <w:p>
+      <w:pPr>
+        <w:spacing w:line="360" w:lineRule="auto"/>
+        <w:jc w:val="both"/>
+        <w:rPr>
+          <w:noProof/>
+          <w:sz w:val="28"/>
+          <w:szCs w:val="28"/>
+          <w14:ligatures w14:val="standardContextual"/>
+        </w:rPr>
+      </w:pPr>
+      <w:r>
+        <w:rPr>
+          <w:noProof/>
+          <w:sz w:val="28"/>
+          <w:szCs w:val="28"/>
+          <w14:ligatures w14:val="standardContextual"/>
+        </w:rPr>
+        <w:tab/>
+      </w:r>
+      <w:r>
+        <w:rPr>
+          <w:noProof/>
+          <w:sz w:val="28"/>
+          <w:szCs w:val="28"/>
+          <w14:ligatures w14:val="standardContextual"/>
+        </w:rPr>
+        <w:t>Після отримання даних відбувається послідовна обробка та перетворення у внутрішню модель стану кубика. Далі виконується пошук циклів перестановок, у результаті чого визначається послідовність переміщень кожного елемента до його потрібної позиції.</w:t>
+      </w:r>
+    </w:p>
+    <w:p>
+      <w:pPr>
+        <w:spacing w:line="360" w:lineRule="auto"/>
+        <w:jc w:val="both"/>
+        <w:rPr>
+          <w:noProof/>
+          <w:sz w:val="28"/>
+          <w:szCs w:val="28"/>
+          <w14:ligatures w14:val="standardContextual"/>
+        </w:rPr>
+      </w:pPr>
+      <w:r>
+        <w:rPr>
+          <w:noProof/>
+          <w:sz w:val="28"/>
+          <w:szCs w:val="28"/>
+          <w14:ligatures w14:val="standardContextual"/>
+        </w:rPr>
+        <w:tab/>
+        <w:t xml:space="preserve">Отримані цикли перестановок трансформуються у буквенні послідовності, які відображають порядок обмінів між елементами. На онові цих даних формуються мнемонічні підказки для запам’ятовування перед складанням. Також </w:t>
+      </w:r>
+      <w:r>
+        <w:rPr>
+          <w:noProof/>
+          <w:sz w:val="28"/>
+          <w:szCs w:val="28"/>
+          <w14:ligatures w14:val="standardContextual"/>
+        </w:rPr>
+        <w:lastRenderedPageBreak/>
+        <w:t>відбувається побудова алгоритму рухів у стандартній нотації кубика Рубіка.</w:t>
+      </w:r>
+    </w:p>
+    <w:p>
+      <w:pPr>
+        <w:spacing w:line="360" w:lineRule="auto"/>
+        <w:jc w:val="center"/>
+        <w:rPr>
+          <w:sz w:val="28"/>
+          <w:szCs w:val="28"/>
+        </w:rPr>
+      </w:pPr>
+      <w:r>
+        <w:rPr>
+          <w:noProof/>
+          <w14:ligatures w14:val="standardContextual"/>
+        </w:rPr>
+        <w:drawing>
+          <wp:inline distT="0" distB="0" distL="0" distR="0" wp14:anchorId="0CEAF78B" wp14:editId="5E91FD28">
+            <wp:extent cx="5227320" cy="4419538"/>
+            <wp:effectExtent l="0" t="0" r="0" b="635"/>
+            <wp:docPr id="707998790" name="Рисунок 1"/>
+            <wp:cNvGraphicFramePr>
+              <a:graphicFrameLocks xmlns:a="http://schemas.openxmlformats.org/drawingml/2006/main" noChangeAspect="1"/>
+            </wp:cNvGraphicFramePr>
+            <a:graphic xmlns:a="http://schemas.openxmlformats.org/drawingml/2006/main">
+              <a:graphicData uri="http://schemas.openxmlformats.org/drawingml/2006/picture">
+                <pic:pic xmlns:pic="http://schemas.openxmlformats.org/drawingml/2006/picture">
+                  <pic:nvPicPr>
+                    <pic:cNvPr id="707998790" name=""/>
+                    <pic:cNvPicPr/>
+                  </pic:nvPicPr>
+                  <pic:blipFill rotWithShape="1">
+                    <a:blip r:embed="rId21"/>
+                    <a:srcRect t="1695" r="182"/>
+                    <a:stretch>
+                      <a:fillRect/>
+                    </a:stretch>
+                  </pic:blipFill>
+                  <pic:spPr bwMode="auto">
+                    <a:xfrm>
+                      <a:off x="0" y="0"/>
+                      <a:ext cx="5233503" cy="4424765"/>
+                    </a:xfrm>
+                    <a:prstGeom prst="rect">
+                      <a:avLst/>
+                    </a:prstGeom>
+                    <a:ln>
+                      <a:noFill/>
+                    </a:ln>
+                    <a:extLst>
+                      <a:ext uri="{53640926-AAD7-44D8-BBD7-CCE9431645EC}">
+                        <a14:shadowObscured xmlns:a14="http://schemas.microsoft.com/office/drawing/2010/main"/>
+                      </a:ext>
+                    </a:extLst>
+                  </pic:spPr>
+                </pic:pic>
+              </a:graphicData>
+            </a:graphic>
+          </wp:inline>
+        </w:drawing>
+      </w:r>
+    </w:p>
+    <w:p>
+      <w:pPr>
+        <w:spacing w:line="360" w:lineRule="auto"/>
+        <w:jc w:val="center"/>
+        <w:rPr>
+          <w:sz w:val="28"/>
+          <w:szCs w:val="28"/>
+        </w:rPr>
+      </w:pPr>
+      <w:r>
+        <w:rPr>
+          <w:sz w:val="28"/>
+          <w:szCs w:val="28"/>
+        </w:rPr>
+        <w:t xml:space="preserve">Рисунок 2.7 </w:t>
+      </w:r>
+      <w:r>
+        <w:rPr>
+          <w:sz w:val="28"/>
+          <w:szCs w:val="28"/>
+        </w:rPr>
+        <w:t>–</w:t>
+      </w:r>
+      <w:r>
+        <w:rPr>
+          <w:sz w:val="28"/>
+          <w:szCs w:val="28"/>
+        </w:rPr>
+        <w:t xml:space="preserve"> </w:t>
+      </w:r>
+      <w:r>
+        <w:rPr>
+          <w:sz w:val="28"/>
+          <w:szCs w:val="28"/>
+          <w:lang w:val="en-US"/>
+        </w:rPr>
+        <w:t xml:space="preserve">View </w:t>
+      </w:r>
+      <w:r>
+        <w:rPr>
+          <w:sz w:val="28"/>
+          <w:szCs w:val="28"/>
+        </w:rPr>
+        <w:t>для обробки запитів користувача</w:t>
+      </w:r>
+    </w:p>
+    <w:p>
+      <w:pPr>
+        <w:spacing w:line="360" w:lineRule="auto"/>
+        <w:jc w:val="center"/>
+        <w:rPr>
+          <w:sz w:val="28"/>
+          <w:szCs w:val="28"/>
+        </w:rPr>
+      </w:pPr>
+    </w:p>
+    <w:p>
+      <w:pPr>
+        <w:spacing w:line="360" w:lineRule="auto"/>
+        <w:rPr>
+          <w:sz w:val="28"/>
+          <w:szCs w:val="28"/>
+          <w:lang w:val="en-US"/>
+        </w:rPr>
+      </w:pPr>
+      <w:r>
+        <w:rPr>
+          <w:sz w:val="28"/>
+          <w:szCs w:val="28"/>
+        </w:rPr>
+        <w:tab/>
+        <w:t xml:space="preserve">Окремо враховується наявність </w:t>
+      </w:r>
+      <w:r>
+        <w:rPr>
+          <w:sz w:val="28"/>
+          <w:szCs w:val="28"/>
+          <w:lang w:val="en-US"/>
+        </w:rPr>
+        <w:t>parity</w:t>
+      </w:r>
+      <w:r>
+        <w:rPr>
+          <w:sz w:val="28"/>
+          <w:szCs w:val="28"/>
+        </w:rPr>
+        <w:t>, який виникає при непарній кількості перестановок. У такому випадку застосовується відповідний алгоритм для вирішення даної ситуації</w:t>
+      </w:r>
+      <w:r>
+        <w:rPr>
+          <w:sz w:val="28"/>
+          <w:szCs w:val="28"/>
+          <w:lang w:val="en-US"/>
+        </w:rPr>
+        <w:t xml:space="preserve"> </w:t>
+      </w:r>
+      <w:r>
+        <w:rPr>
+          <w:sz w:val="28"/>
+          <w:szCs w:val="28"/>
+        </w:rPr>
+        <w:t>в залежності від методу</w:t>
+      </w:r>
+      <w:r>
+        <w:rPr>
+          <w:sz w:val="28"/>
+          <w:szCs w:val="28"/>
+          <w:lang w:val="en-US"/>
+        </w:rPr>
+        <w:t>: R-Perm</w:t>
+      </w:r>
+      <w:r>
+        <w:rPr>
+          <w:sz w:val="28"/>
+          <w:szCs w:val="28"/>
+          <w:lang w:val="en-US"/>
+        </w:rPr>
+        <w:t xml:space="preserve"> </w:t>
+      </w:r>
+      <w:r>
+        <w:rPr>
+          <w:sz w:val="28"/>
+          <w:szCs w:val="28"/>
+        </w:rPr>
+        <w:t>для</w:t>
+      </w:r>
+      <w:r>
+        <w:rPr>
+          <w:sz w:val="28"/>
+          <w:szCs w:val="28"/>
+          <w:lang w:val="en-US"/>
+        </w:rPr>
+        <w:t xml:space="preserve"> </w:t>
+      </w:r>
+      <w:proofErr w:type="spellStart"/>
+      <w:r>
+        <w:rPr>
+          <w:sz w:val="28"/>
+          <w:szCs w:val="28"/>
+          <w:lang w:val="en-US"/>
+        </w:rPr>
+        <w:t>OldPochmann</w:t>
+      </w:r>
+      <w:proofErr w:type="spellEnd"/>
+      <w:r>
+        <w:rPr>
+          <w:sz w:val="28"/>
+          <w:szCs w:val="28"/>
+          <w:lang w:val="en-US"/>
+        </w:rPr>
+        <w:t xml:space="preserve"> </w:t>
+      </w:r>
+      <w:r>
+        <w:rPr>
+          <w:sz w:val="28"/>
+          <w:szCs w:val="28"/>
+        </w:rPr>
+        <w:t xml:space="preserve">або </w:t>
+      </w:r>
+      <w:r>
+        <w:rPr>
+          <w:sz w:val="28"/>
+          <w:szCs w:val="28"/>
+          <w:lang w:val="en-US"/>
+        </w:rPr>
+        <w:t xml:space="preserve">M2-parity </w:t>
+      </w:r>
+      <w:r>
+        <w:rPr>
+          <w:sz w:val="28"/>
+          <w:szCs w:val="28"/>
+        </w:rPr>
+        <w:t xml:space="preserve">для </w:t>
+      </w:r>
+      <w:r>
+        <w:rPr>
+          <w:sz w:val="28"/>
+          <w:szCs w:val="28"/>
+          <w:lang w:val="en-US"/>
+        </w:rPr>
+        <w:t xml:space="preserve">M2. </w:t>
+      </w:r>
+      <w:r>
+        <w:rPr>
+          <w:sz w:val="28"/>
+          <w:szCs w:val="28"/>
+        </w:rPr>
+        <w:t>Таким чином, виконується повний цикл перетворення вхідної конфігурації кубика у готовий набір алгоритмічних кроків для його складання методами збірки наосліп.</w:t>
+      </w:r>
+      <w:r>
+        <w:rPr>
+          <w:sz w:val="28"/>
+          <w:szCs w:val="28"/>
+          <w:lang w:val="en-US"/>
+        </w:rPr>
+        <w:t xml:space="preserve"> </w:t>
       </w:r>
     </w:p>
     <w:sectPr>
-      <w:headerReference w:type="default" r:id="rId20"/>
+      <w:headerReference w:type="default" r:id="rId22"/>
       <w:pgSz w:w="11906" w:h="16838"/>
       <w:pgMar w:top="1134" w:right="567" w:bottom="1134" w:left="1418" w:header="709" w:footer="709" w:gutter="0"/>
       <w:pgNumType w:start="1"/>
@@ -15366,7 +16131,6 @@
   <w:style w:type="character" w:default="1" w:styleId="a0">
     <w:name w:val="Default Paragraph Font"/>
     <w:uiPriority w:val="1"/>
-    <w:semiHidden/>
     <w:unhideWhenUsed/>
   </w:style>
   <w:style w:type="table" w:default="1" w:styleId="a1">

</xml_diff>